<commit_message>
modified:   resources/playbook/PB00_Biohub Rapid Response mNGS Training Playbook.docx
</commit_message>
<xml_diff>
--- a/resources/playbook/PB00_Biohub Rapid Response mNGS Training Playbook.docx
+++ b/resources/playbook/PB00_Biohub Rapid Response mNGS Training Playbook.docx
@@ -38284,17 +38284,23 @@
               <w:spacing w:line="240" w:lineRule="auto"/>
               <w:rPr/>
             </w:pPr>
-            <w:r>
-              <w:rPr>
-                <w:rtl w:val="0"/>
-              </w:rPr>
-              <w:t xml:space="preserve">PB01_Folder Structure Template</w:t>
-            </w:r>
-            <w:r>
-              <w:rPr>
-                <w:rtl w:val="0"/>
-              </w:rPr>
-            </w:r>
+            <w:hyperlink r:id="rId33">
+              <w:r>
+                <w:rPr>
+                  <w:rtl w:val="0"/>
+                  <w:color w:val="1155CC"/>
+                  <w:u w:val="single"/>
+                </w:rPr>
+                <w:t xml:space="preserve">PB01_Folder Structure Template</w:t>
+              </w:r>
+              <w:r>
+                <w:rPr>
+                  <w:rtl w:val="0"/>
+                  <w:color w:val="1155CC"/>
+                  <w:u w:val="single"/>
+                </w:rPr>
+              </w:r>
+            </w:hyperlink>
           </w:p>
         </w:tc>
       </w:tr>
@@ -38381,17 +38387,23 @@
               <w:spacing w:line="240" w:lineRule="auto"/>
               <w:rPr/>
             </w:pPr>
-            <w:r>
-              <w:rPr>
-                <w:rtl w:val="0"/>
-              </w:rPr>
-              <w:t xml:space="preserve">PB02_Training Program Master Tracker Template</w:t>
-            </w:r>
-            <w:r>
-              <w:rPr>
-                <w:rtl w:val="0"/>
-              </w:rPr>
-            </w:r>
+            <w:hyperlink r:id="rId34">
+              <w:r>
+                <w:rPr>
+                  <w:rtl w:val="0"/>
+                  <w:color w:val="1155CC"/>
+                  <w:u w:val="single"/>
+                </w:rPr>
+                <w:t xml:space="preserve">PB02_Training Program Master Tracker Template</w:t>
+              </w:r>
+              <w:r>
+                <w:rPr>
+                  <w:rtl w:val="0"/>
+                  <w:color w:val="1155CC"/>
+                  <w:u w:val="single"/>
+                </w:rPr>
+              </w:r>
+            </w:hyperlink>
           </w:p>
         </w:tc>
       </w:tr>
@@ -38479,17 +38491,23 @@
               <w:spacing w:line="240" w:lineRule="auto"/>
               <w:rPr/>
             </w:pPr>
-            <w:r>
-              <w:rPr>
-                <w:rtl w:val="0"/>
-              </w:rPr>
-              <w:t xml:space="preserve">PB03_Training Plan Template</w:t>
-            </w:r>
-            <w:r>
-              <w:rPr>
-                <w:rtl w:val="0"/>
-              </w:rPr>
-            </w:r>
+            <w:hyperlink r:id="rId35">
+              <w:r>
+                <w:rPr>
+                  <w:rtl w:val="0"/>
+                  <w:color w:val="1155CC"/>
+                  <w:u w:val="single"/>
+                </w:rPr>
+                <w:t xml:space="preserve">PB03_Training Plan Template</w:t>
+              </w:r>
+              <w:r>
+                <w:rPr>
+                  <w:rtl w:val="0"/>
+                  <w:color w:val="1155CC"/>
+                  <w:u w:val="single"/>
+                </w:rPr>
+              </w:r>
+            </w:hyperlink>
           </w:p>
         </w:tc>
       </w:tr>
@@ -38577,17 +38595,23 @@
               <w:spacing w:line="240" w:lineRule="auto"/>
               <w:rPr/>
             </w:pPr>
-            <w:r>
-              <w:rPr>
-                <w:rtl w:val="0"/>
-              </w:rPr>
-              <w:t xml:space="preserve">PB04_Lab Capacity Survey Template</w:t>
-            </w:r>
-            <w:r>
-              <w:rPr>
-                <w:rtl w:val="0"/>
-              </w:rPr>
-            </w:r>
+            <w:hyperlink r:id="rId36">
+              <w:r>
+                <w:rPr>
+                  <w:rtl w:val="0"/>
+                  <w:color w:val="1155CC"/>
+                  <w:u w:val="single"/>
+                </w:rPr>
+                <w:t xml:space="preserve">PB04_Lab Capacity Survey Template</w:t>
+              </w:r>
+              <w:r>
+                <w:rPr>
+                  <w:rtl w:val="0"/>
+                  <w:color w:val="1155CC"/>
+                  <w:u w:val="single"/>
+                </w:rPr>
+              </w:r>
+            </w:hyperlink>
           </w:p>
         </w:tc>
       </w:tr>
@@ -38681,17 +38705,23 @@
               <w:spacing w:line="240" w:lineRule="auto"/>
               <w:rPr/>
             </w:pPr>
-            <w:r>
-              <w:rPr>
-                <w:rtl w:val="0"/>
-              </w:rPr>
-              <w:t xml:space="preserve">PB05_MTA (Biological Samples BLANK)</w:t>
-            </w:r>
-            <w:r>
-              <w:rPr>
-                <w:rtl w:val="0"/>
-              </w:rPr>
-            </w:r>
+            <w:hyperlink r:id="rId37">
+              <w:r>
+                <w:rPr>
+                  <w:rtl w:val="0"/>
+                  <w:color w:val="1155CC"/>
+                  <w:u w:val="single"/>
+                </w:rPr>
+                <w:t xml:space="preserve">PB05_MTA (Biological Sample-BLANK)</w:t>
+              </w:r>
+              <w:r>
+                <w:rPr>
+                  <w:rtl w:val="0"/>
+                  <w:color w:val="1155CC"/>
+                  <w:u w:val="single"/>
+                </w:rPr>
+              </w:r>
+            </w:hyperlink>
           </w:p>
         </w:tc>
       </w:tr>
@@ -38788,17 +38818,23 @@
               <w:spacing w:line="240" w:lineRule="auto"/>
               <w:rPr/>
             </w:pPr>
-            <w:r>
-              <w:rPr>
-                <w:rtl w:val="0"/>
-              </w:rPr>
-              <w:t xml:space="preserve">PB06_MTA (Human Sample BLANK)</w:t>
-            </w:r>
-            <w:r>
-              <w:rPr>
-                <w:rtl w:val="0"/>
-              </w:rPr>
-            </w:r>
+            <w:hyperlink r:id="rId38">
+              <w:r>
+                <w:rPr>
+                  <w:rtl w:val="0"/>
+                  <w:color w:val="1155CC"/>
+                  <w:u w:val="single"/>
+                </w:rPr>
+                <w:t xml:space="preserve">PB06_MTA (Human Sample-BLANK)</w:t>
+              </w:r>
+              <w:r>
+                <w:rPr>
+                  <w:rtl w:val="0"/>
+                  <w:color w:val="1155CC"/>
+                  <w:u w:val="single"/>
+                </w:rPr>
+              </w:r>
+            </w:hyperlink>
           </w:p>
         </w:tc>
       </w:tr>
@@ -38886,17 +38922,23 @@
               <w:spacing w:line="240" w:lineRule="auto"/>
               <w:rPr/>
             </w:pPr>
-            <w:r>
-              <w:rPr>
-                <w:rtl w:val="0"/>
-              </w:rPr>
-              <w:t xml:space="preserve">PB07_mNGS Training Playbook Master Tracker</w:t>
-            </w:r>
-            <w:r>
-              <w:rPr>
-                <w:rtl w:val="0"/>
-              </w:rPr>
-            </w:r>
+            <w:hyperlink r:id="rId39">
+              <w:r>
+                <w:rPr>
+                  <w:rtl w:val="0"/>
+                  <w:color w:val="1155CC"/>
+                  <w:u w:val="single"/>
+                </w:rPr>
+                <w:t xml:space="preserve">PB07_mNGS Training Playbook Master Tracker</w:t>
+              </w:r>
+              <w:r>
+                <w:rPr>
+                  <w:rtl w:val="0"/>
+                  <w:color w:val="1155CC"/>
+                  <w:u w:val="single"/>
+                </w:rPr>
+              </w:r>
+            </w:hyperlink>
           </w:p>
         </w:tc>
       </w:tr>
@@ -38983,17 +39025,23 @@
               <w:spacing w:line="240" w:lineRule="auto"/>
               <w:rPr/>
             </w:pPr>
-            <w:r>
-              <w:rPr>
-                <w:rtl w:val="0"/>
-              </w:rPr>
-              <w:t xml:space="preserve">PB08_Study Intake Form</w:t>
-            </w:r>
-            <w:r>
-              <w:rPr>
-                <w:rtl w:val="0"/>
-              </w:rPr>
-            </w:r>
+            <w:hyperlink r:id="rId40">
+              <w:r>
+                <w:rPr>
+                  <w:rtl w:val="0"/>
+                  <w:color w:val="1155CC"/>
+                  <w:u w:val="single"/>
+                </w:rPr>
+                <w:t xml:space="preserve">PB08_Study Intake Form</w:t>
+              </w:r>
+              <w:r>
+                <w:rPr>
+                  <w:rtl w:val="0"/>
+                  <w:color w:val="1155CC"/>
+                  <w:u w:val="single"/>
+                </w:rPr>
+              </w:r>
+            </w:hyperlink>
           </w:p>
         </w:tc>
       </w:tr>
@@ -39087,17 +39135,23 @@
               <w:spacing w:line="240" w:lineRule="auto"/>
               <w:rPr/>
             </w:pPr>
-            <w:r>
-              <w:rPr>
-                <w:rtl w:val="0"/>
-              </w:rPr>
-              <w:t xml:space="preserve">PB09_Dry Lab Intake Form</w:t>
-            </w:r>
-            <w:r>
-              <w:rPr>
-                <w:rtl w:val="0"/>
-              </w:rPr>
-            </w:r>
+            <w:hyperlink r:id="rId41">
+              <w:r>
+                <w:rPr>
+                  <w:rtl w:val="0"/>
+                  <w:color w:val="1155CC"/>
+                  <w:u w:val="single"/>
+                </w:rPr>
+                <w:t xml:space="preserve">PB09_Dry Lab Intake Form</w:t>
+              </w:r>
+              <w:r>
+                <w:rPr>
+                  <w:rtl w:val="0"/>
+                  <w:color w:val="1155CC"/>
+                  <w:u w:val="single"/>
+                </w:rPr>
+              </w:r>
+            </w:hyperlink>
           </w:p>
         </w:tc>
       </w:tr>
@@ -39184,17 +39238,23 @@
               <w:spacing w:line="240" w:lineRule="auto"/>
               <w:rPr/>
             </w:pPr>
-            <w:r>
-              <w:rPr>
-                <w:rtl w:val="0"/>
-              </w:rPr>
-              <w:t xml:space="preserve">PB10_mNGS Training Equipment Reagents Materials List</w:t>
-            </w:r>
-            <w:r>
-              <w:rPr>
-                <w:rtl w:val="0"/>
-              </w:rPr>
-            </w:r>
+            <w:hyperlink r:id="rId42">
+              <w:r>
+                <w:rPr>
+                  <w:rtl w:val="0"/>
+                  <w:color w:val="1155CC"/>
+                  <w:u w:val="single"/>
+                </w:rPr>
+                <w:t xml:space="preserve">PB10_mNGS Training Equipment Reagents Materials List</w:t>
+              </w:r>
+              <w:r>
+                <w:rPr>
+                  <w:rtl w:val="0"/>
+                  <w:color w:val="1155CC"/>
+                  <w:u w:val="single"/>
+                </w:rPr>
+              </w:r>
+            </w:hyperlink>
           </w:p>
         </w:tc>
       </w:tr>
@@ -39283,13 +39343,17 @@
                 <w:color w:val="000000"/>
               </w:rPr>
             </w:pPr>
-            <w:r>
-              <w:rPr>
-                <w:color w:val="000000"/>
-                <w:rtl w:val="0"/>
-              </w:rPr>
-              <w:t xml:space="preserve">PB11_Sample Shipping Metadata Template</w:t>
-            </w:r>
+            <w:hyperlink r:id="rId43">
+              <w:r>
+                <w:rPr>
+                  <w:color w:val="000000"/>
+                  <w:rtl w:val="0"/>
+                  <w:color w:val="1155CC"/>
+                  <w:u w:val="single"/>
+                </w:rPr>
+                <w:t xml:space="preserve">PB11_Sample Shipping Metadata Template</w:t>
+              </w:r>
+            </w:hyperlink>
           </w:p>
         </w:tc>
       </w:tr>
@@ -39385,13 +39449,17 @@
                 <w:color w:val="000000"/>
               </w:rPr>
             </w:pPr>
-            <w:r>
-              <w:rPr>
-                <w:color w:val="000000"/>
-                <w:rtl w:val="0"/>
-              </w:rPr>
-              <w:t xml:space="preserve">PB12_ Example of Course Description</w:t>
-            </w:r>
+            <w:hyperlink r:id="rId44">
+              <w:r>
+                <w:rPr>
+                  <w:color w:val="000000"/>
+                  <w:rtl w:val="0"/>
+                  <w:color w:val="1155CC"/>
+                  <w:u w:val="single"/>
+                </w:rPr>
+                <w:t xml:space="preserve">PB12_Example of Course Description</w:t>
+              </w:r>
+            </w:hyperlink>
           </w:p>
         </w:tc>
       </w:tr>
@@ -39487,13 +39555,17 @@
                 <w:color w:val="000000"/>
               </w:rPr>
             </w:pPr>
-            <w:r>
-              <w:rPr>
-                <w:color w:val="000000"/>
-                <w:rtl w:val="0"/>
-              </w:rPr>
-              <w:t xml:space="preserve">PB13_Example Training Schedule_facilitator</w:t>
-            </w:r>
+            <w:hyperlink r:id="rId45">
+              <w:r>
+                <w:rPr>
+                  <w:color w:val="000000"/>
+                  <w:rtl w:val="0"/>
+                  <w:color w:val="1155CC"/>
+                  <w:u w:val="single"/>
+                </w:rPr>
+                <w:t xml:space="preserve">PB13_Example Training Schedule_facilitator</w:t>
+              </w:r>
+            </w:hyperlink>
           </w:p>
         </w:tc>
       </w:tr>
@@ -39589,13 +39661,17 @@
                 <w:color w:val="000000"/>
               </w:rPr>
             </w:pPr>
-            <w:r>
-              <w:rPr>
-                <w:color w:val="000000"/>
-                <w:rtl w:val="0"/>
-              </w:rPr>
-              <w:t xml:space="preserve">PB14_mNGS Training Communication Plan Template</w:t>
-            </w:r>
+            <w:hyperlink r:id="rId46">
+              <w:r>
+                <w:rPr>
+                  <w:color w:val="000000"/>
+                  <w:rtl w:val="0"/>
+                  <w:color w:val="1155CC"/>
+                  <w:u w:val="single"/>
+                </w:rPr>
+                <w:t xml:space="preserve">PB14_mNGS Training Communication Plan Template</w:t>
+              </w:r>
+            </w:hyperlink>
           </w:p>
         </w:tc>
       </w:tr>
@@ -39691,13 +39767,17 @@
                 <w:color w:val="000000"/>
               </w:rPr>
             </w:pPr>
-            <w:r>
-              <w:rPr>
-                <w:color w:val="000000"/>
-                <w:rtl w:val="0"/>
-              </w:rPr>
-              <w:t xml:space="preserve">PB15_Illumina mNGS Training Booklet</w:t>
-            </w:r>
+            <w:hyperlink r:id="rId47">
+              <w:r>
+                <w:rPr>
+                  <w:color w:val="000000"/>
+                  <w:rtl w:val="0"/>
+                  <w:color w:val="1155CC"/>
+                  <w:u w:val="single"/>
+                </w:rPr>
+                <w:t xml:space="preserve">PB15_Illumina mNGS Training Booklet</w:t>
+              </w:r>
+            </w:hyperlink>
           </w:p>
         </w:tc>
       </w:tr>
@@ -39786,18 +39866,24 @@
                 <w:color w:val="000000"/>
               </w:rPr>
             </w:pPr>
-            <w:r>
-              <w:rPr>
-                <w:color w:val="000000"/>
-                <w:rtl w:val="0"/>
-              </w:rPr>
-              <w:t xml:space="preserve">PB16_ONT mNGS Training Booklet</w:t>
-            </w:r>
-            <w:r>
-              <w:rPr>
-                <w:rtl w:val="0"/>
-              </w:rPr>
-            </w:r>
+            <w:hyperlink r:id="rId48">
+              <w:r>
+                <w:rPr>
+                  <w:color w:val="000000"/>
+                  <w:rtl w:val="0"/>
+                  <w:color w:val="1155CC"/>
+                  <w:u w:val="single"/>
+                </w:rPr>
+                <w:t xml:space="preserve">PB16_ONT mNGS Training Booklet</w:t>
+              </w:r>
+              <w:r>
+                <w:rPr>
+                  <w:rtl w:val="0"/>
+                  <w:color w:val="1155CC"/>
+                  <w:u w:val="single"/>
+                </w:rPr>
+              </w:r>
+            </w:hyperlink>
           </w:p>
         </w:tc>
       </w:tr>

</xml_diff>